<commit_message>
Update Week 05 lab materials
</commit_message>
<xml_diff>
--- a/ANLY500-Analytics-I/Week05/lab/05_lab.docx
+++ b/ANLY500-Analytics-I/Week05/lab/05_lab.docx
@@ -281,1300 +281,6 @@
       </w:pPr>
       <w:r>
         <w:t xml:space="preserve">Please note that each subpoint (i.e. a, b) indicates a different chart.</w:t>
-      </w:r>
-    </w:p>
-    <w:p>
-      <w:pPr>
-        <w:pStyle w:val="SourceCode"/>
-      </w:pPr>
-      <w:r>
-        <w:rPr>
-          <w:rStyle w:val="CommentTok"/>
-        </w:rPr>
-        <w:t xml:space="preserve"># Load required libraries</w:t>
-      </w:r>
-      <w:r>
-        <w:br/>
-      </w:r>
-      <w:r>
-        <w:rPr>
-          <w:rStyle w:val="FunctionTok"/>
-        </w:rPr>
-        <w:t xml:space="preserve">library</w:t>
-      </w:r>
-      <w:r>
-        <w:rPr>
-          <w:rStyle w:val="NormalTok"/>
-        </w:rPr>
-        <w:t xml:space="preserve">(rio)</w:t>
-      </w:r>
-      <w:r>
-        <w:br/>
-      </w:r>
-      <w:r>
-        <w:rPr>
-          <w:rStyle w:val="FunctionTok"/>
-        </w:rPr>
-        <w:t xml:space="preserve">library</w:t>
-      </w:r>
-      <w:r>
-        <w:rPr>
-          <w:rStyle w:val="NormalTok"/>
-        </w:rPr>
-        <w:t xml:space="preserve">(ggplot2)</w:t>
-      </w:r>
-      <w:r>
-        <w:br/>
-      </w:r>
-      <w:r>
-        <w:br/>
-      </w:r>
-      <w:r>
-        <w:rPr>
-          <w:rStyle w:val="CommentTok"/>
-        </w:rPr>
-        <w:t xml:space="preserve"># Load the lab dataset</w:t>
-      </w:r>
-      <w:r>
-        <w:br/>
-      </w:r>
-      <w:r>
-        <w:rPr>
-          <w:rStyle w:val="NormalTok"/>
-        </w:rPr>
-        <w:t xml:space="preserve">labdata </w:t>
-      </w:r>
-      <w:r>
-        <w:rPr>
-          <w:rStyle w:val="OtherTok"/>
-        </w:rPr>
-        <w:t xml:space="preserve">&lt;-</w:t>
-      </w:r>
-      <w:r>
-        <w:rPr>
-          <w:rStyle w:val="NormalTok"/>
-        </w:rPr>
-        <w:t xml:space="preserve"> </w:t>
-      </w:r>
-      <w:r>
-        <w:rPr>
-          <w:rStyle w:val="FunctionTok"/>
-        </w:rPr>
-        <w:t xml:space="preserve">import</w:t>
-      </w:r>
-      <w:r>
-        <w:rPr>
-          <w:rStyle w:val="NormalTok"/>
-        </w:rPr>
-        <w:t xml:space="preserve">(</w:t>
-      </w:r>
-      <w:r>
-        <w:rPr>
-          <w:rStyle w:val="StringTok"/>
-        </w:rPr>
-        <w:t xml:space="preserve">"05_data.csv"</w:t>
-      </w:r>
-      <w:r>
-        <w:rPr>
-          <w:rStyle w:val="NormalTok"/>
-        </w:rPr>
-        <w:t xml:space="preserve">)</w:t>
-      </w:r>
-      <w:r>
-        <w:br/>
-      </w:r>
-      <w:r>
-        <w:br/>
-      </w:r>
-      <w:r>
-        <w:rPr>
-          <w:rStyle w:val="CommentTok"/>
-        </w:rPr>
-        <w:t xml:space="preserve"># Display structure of the data</w:t>
-      </w:r>
-      <w:r>
-        <w:br/>
-      </w:r>
-      <w:r>
-        <w:rPr>
-          <w:rStyle w:val="FunctionTok"/>
-        </w:rPr>
-        <w:t xml:space="preserve">str</w:t>
-      </w:r>
-      <w:r>
-        <w:rPr>
-          <w:rStyle w:val="NormalTok"/>
-        </w:rPr>
-        <w:t xml:space="preserve">(labdata)</w:t>
-      </w:r>
-    </w:p>
-    <w:p>
-      <w:pPr>
-        <w:pStyle w:val="SourceCode"/>
-      </w:pPr>
-      <w:r>
-        <w:rPr>
-          <w:rStyle w:val="VerbatimChar"/>
-        </w:rPr>
-        <w:t xml:space="preserve">## 'data.frame':    300 obs. of  5 variables:</w:t>
-      </w:r>
-      <w:r>
-        <w:br/>
-      </w:r>
-      <w:r>
-        <w:rPr>
-          <w:rStyle w:val="VerbatimChar"/>
-        </w:rPr>
-        <w:t xml:space="preserve">##  $ id       : chr  "S001" "S002" "S003" "S004" ...</w:t>
-      </w:r>
-      <w:r>
-        <w:br/>
-      </w:r>
-      <w:r>
-        <w:rPr>
-          <w:rStyle w:val="VerbatimChar"/>
-        </w:rPr>
-        <w:t xml:space="preserve">##  $ biz_focus: chr  "forward" "forward" "forward" "forward" ...</w:t>
-      </w:r>
-      <w:r>
-        <w:br/>
-      </w:r>
-      <w:r>
-        <w:rPr>
-          <w:rStyle w:val="VerbatimChar"/>
-        </w:rPr>
-        <w:t xml:space="preserve">##  $ internet : chr  "high" "high" "high" "high" ...</w:t>
-      </w:r>
-      <w:r>
-        <w:br/>
-      </w:r>
-      <w:r>
-        <w:rPr>
-          <w:rStyle w:val="VerbatimChar"/>
-        </w:rPr>
-        <w:t xml:space="preserve">##  $ time.1   : num  7.54 7.57 5.93 6.77 7.62 ...</w:t>
-      </w:r>
-      <w:r>
-        <w:br/>
-      </w:r>
-      <w:r>
-        <w:rPr>
-          <w:rStyle w:val="VerbatimChar"/>
-        </w:rPr>
-        <w:t xml:space="preserve">##  $ time.2   : num  9.71 10.24 9.18 10.5 8.69 ...</w:t>
-      </w:r>
-    </w:p>
-    <w:p>
-      <w:pPr>
-        <w:pStyle w:val="SourceCode"/>
-      </w:pPr>
-      <w:r>
-        <w:rPr>
-          <w:rStyle w:val="CommentTok"/>
-        </w:rPr>
-        <w:t xml:space="preserve"># Summary statistics</w:t>
-      </w:r>
-      <w:r>
-        <w:br/>
-      </w:r>
-      <w:r>
-        <w:rPr>
-          <w:rStyle w:val="FunctionTok"/>
-        </w:rPr>
-        <w:t xml:space="preserve">summary</w:t>
-      </w:r>
-      <w:r>
-        <w:rPr>
-          <w:rStyle w:val="NormalTok"/>
-        </w:rPr>
-        <w:t xml:space="preserve">(labdata)</w:t>
-      </w:r>
-    </w:p>
-    <w:p>
-      <w:pPr>
-        <w:pStyle w:val="SourceCode"/>
-      </w:pPr>
-      <w:r>
-        <w:rPr>
-          <w:rStyle w:val="VerbatimChar"/>
-        </w:rPr>
-        <w:t xml:space="preserve">##       id             biz_focus           internet             time.1       </w:t>
-      </w:r>
-      <w:r>
-        <w:br/>
-      </w:r>
-      <w:r>
-        <w:rPr>
-          <w:rStyle w:val="VerbatimChar"/>
-        </w:rPr>
-        <w:t xml:space="preserve">##  Length:300         Length:300         Length:300         Min.   :-0.6805  </w:t>
-      </w:r>
-      <w:r>
-        <w:br/>
-      </w:r>
-      <w:r>
-        <w:rPr>
-          <w:rStyle w:val="VerbatimChar"/>
-        </w:rPr>
-        <w:t xml:space="preserve">##  Class :character   Class :character   Class :character   1st Qu.: 2.0516  </w:t>
-      </w:r>
-      <w:r>
-        <w:br/>
-      </w:r>
-      <w:r>
-        <w:rPr>
-          <w:rStyle w:val="VerbatimChar"/>
-        </w:rPr>
-        <w:t xml:space="preserve">##  Mode  :character   Mode  :character   Mode  :character   Median : 3.3273  </w:t>
-      </w:r>
-      <w:r>
-        <w:br/>
-      </w:r>
-      <w:r>
-        <w:rPr>
-          <w:rStyle w:val="VerbatimChar"/>
-        </w:rPr>
-        <w:t xml:space="preserve">##                                                           Mean   : 3.6253  </w:t>
-      </w:r>
-      <w:r>
-        <w:br/>
-      </w:r>
-      <w:r>
-        <w:rPr>
-          <w:rStyle w:val="VerbatimChar"/>
-        </w:rPr>
-        <w:t xml:space="preserve">##                                                           3rd Qu.: 4.7821  </w:t>
-      </w:r>
-      <w:r>
-        <w:br/>
-      </w:r>
-      <w:r>
-        <w:rPr>
-          <w:rStyle w:val="VerbatimChar"/>
-        </w:rPr>
-        <w:t xml:space="preserve">##                                                           Max.   : 9.9014  </w:t>
-      </w:r>
-      <w:r>
-        <w:br/>
-      </w:r>
-      <w:r>
-        <w:rPr>
-          <w:rStyle w:val="VerbatimChar"/>
-        </w:rPr>
-        <w:t xml:space="preserve">##      time.2       </w:t>
-      </w:r>
-      <w:r>
-        <w:br/>
-      </w:r>
-      <w:r>
-        <w:rPr>
-          <w:rStyle w:val="VerbatimChar"/>
-        </w:rPr>
-        <w:t xml:space="preserve">##  Min.   :-0.1169  </w:t>
-      </w:r>
-      <w:r>
-        <w:br/>
-      </w:r>
-      <w:r>
-        <w:rPr>
-          <w:rStyle w:val="VerbatimChar"/>
-        </w:rPr>
-        <w:t xml:space="preserve">##  1st Qu.: 3.0242  </w:t>
-      </w:r>
-      <w:r>
-        <w:br/>
-      </w:r>
-      <w:r>
-        <w:rPr>
-          <w:rStyle w:val="VerbatimChar"/>
-        </w:rPr>
-        <w:t xml:space="preserve">##  Median : 4.4151  </w:t>
-      </w:r>
-      <w:r>
-        <w:br/>
-      </w:r>
-      <w:r>
-        <w:rPr>
-          <w:rStyle w:val="VerbatimChar"/>
-        </w:rPr>
-        <w:t xml:space="preserve">##  Mean   : 5.2299  </w:t>
-      </w:r>
-      <w:r>
-        <w:br/>
-      </w:r>
-      <w:r>
-        <w:rPr>
-          <w:rStyle w:val="VerbatimChar"/>
-        </w:rPr>
-        <w:t xml:space="preserve">##  3rd Qu.: 7.2588  </w:t>
-      </w:r>
-      <w:r>
-        <w:br/>
-      </w:r>
-      <w:r>
-        <w:rPr>
-          <w:rStyle w:val="VerbatimChar"/>
-        </w:rPr>
-        <w:t xml:space="preserve">##  Max.   :12.1847</w:t>
-      </w:r>
-    </w:p>
-    <w:p>
-      <w:pPr>
-        <w:pStyle w:val="SourceCode"/>
-      </w:pPr>
-      <w:r>
-        <w:rPr>
-          <w:rStyle w:val="CommentTok"/>
-        </w:rPr>
-        <w:t xml:space="preserve"># Check first few rows</w:t>
-      </w:r>
-      <w:r>
-        <w:br/>
-      </w:r>
-      <w:r>
-        <w:rPr>
-          <w:rStyle w:val="FunctionTok"/>
-        </w:rPr>
-        <w:t xml:space="preserve">head</w:t>
-      </w:r>
-      <w:r>
-        <w:rPr>
-          <w:rStyle w:val="NormalTok"/>
-        </w:rPr>
-        <w:t xml:space="preserve">(labdata)</w:t>
-      </w:r>
-    </w:p>
-    <w:p>
-      <w:pPr>
-        <w:pStyle w:val="SourceCode"/>
-      </w:pPr>
-      <w:r>
-        <w:rPr>
-          <w:rStyle w:val="VerbatimChar"/>
-        </w:rPr>
-        <w:t xml:space="preserve">##     id biz_focus internet   time.1    time.2</w:t>
-      </w:r>
-      <w:r>
-        <w:br/>
-      </w:r>
-      <w:r>
-        <w:rPr>
-          <w:rStyle w:val="VerbatimChar"/>
-        </w:rPr>
-        <w:t xml:space="preserve">## 1 S001   forward     high 7.544619  9.711458</w:t>
-      </w:r>
-      <w:r>
-        <w:br/>
-      </w:r>
-      <w:r>
-        <w:rPr>
-          <w:rStyle w:val="VerbatimChar"/>
-        </w:rPr>
-        <w:t xml:space="preserve">## 2 S002   forward     high 7.566022 10.237006</w:t>
-      </w:r>
-      <w:r>
-        <w:br/>
-      </w:r>
-      <w:r>
-        <w:rPr>
-          <w:rStyle w:val="VerbatimChar"/>
-        </w:rPr>
-        <w:t xml:space="preserve">## 3 S003   forward     high 5.930514  9.183059</w:t>
-      </w:r>
-      <w:r>
-        <w:br/>
-      </w:r>
-      <w:r>
-        <w:rPr>
-          <w:rStyle w:val="VerbatimChar"/>
-        </w:rPr>
-        <w:t xml:space="preserve">## 4 S004   forward     high 6.773251 10.495166</w:t>
-      </w:r>
-      <w:r>
-        <w:br/>
-      </w:r>
-      <w:r>
-        <w:rPr>
-          <w:rStyle w:val="VerbatimChar"/>
-        </w:rPr>
-        <w:t xml:space="preserve">## 5 S005   forward     high 7.621748  8.689356</w:t>
-      </w:r>
-      <w:r>
-        <w:br/>
-      </w:r>
-      <w:r>
-        <w:rPr>
-          <w:rStyle w:val="VerbatimChar"/>
-        </w:rPr>
-        <w:t xml:space="preserve">## 6 S006   forward     high 8.107049 10.265340</w:t>
-      </w:r>
-    </w:p>
-    <w:p>
-      <w:pPr>
-        <w:pStyle w:val="SourceCode"/>
-      </w:pPr>
-      <w:r>
-        <w:rPr>
-          <w:rStyle w:val="CommentTok"/>
-        </w:rPr>
-        <w:t xml:space="preserve"># Factor the categorical variables</w:t>
-      </w:r>
-      <w:r>
-        <w:br/>
-      </w:r>
-      <w:r>
-        <w:rPr>
-          <w:rStyle w:val="NormalTok"/>
-        </w:rPr>
-        <w:t xml:space="preserve">labdata</w:t>
-      </w:r>
-      <w:r>
-        <w:rPr>
-          <w:rStyle w:val="SpecialCharTok"/>
-        </w:rPr>
-        <w:t xml:space="preserve">$</w:t>
-      </w:r>
-      <w:r>
-        <w:rPr>
-          <w:rStyle w:val="NormalTok"/>
-        </w:rPr>
-        <w:t xml:space="preserve">biz_focus </w:t>
-      </w:r>
-      <w:r>
-        <w:rPr>
-          <w:rStyle w:val="OtherTok"/>
-        </w:rPr>
-        <w:t xml:space="preserve">&lt;-</w:t>
-      </w:r>
-      <w:r>
-        <w:rPr>
-          <w:rStyle w:val="NormalTok"/>
-        </w:rPr>
-        <w:t xml:space="preserve"> </w:t>
-      </w:r>
-      <w:r>
-        <w:rPr>
-          <w:rStyle w:val="FunctionTok"/>
-        </w:rPr>
-        <w:t xml:space="preserve">factor</w:t>
-      </w:r>
-      <w:r>
-        <w:rPr>
-          <w:rStyle w:val="NormalTok"/>
-        </w:rPr>
-        <w:t xml:space="preserve">(labdata</w:t>
-      </w:r>
-      <w:r>
-        <w:rPr>
-          <w:rStyle w:val="SpecialCharTok"/>
-        </w:rPr>
-        <w:t xml:space="preserve">$</w:t>
-      </w:r>
-      <w:r>
-        <w:rPr>
-          <w:rStyle w:val="NormalTok"/>
-        </w:rPr>
-        <w:t xml:space="preserve">biz_focus,</w:t>
-      </w:r>
-      <w:r>
-        <w:br/>
-      </w:r>
-      <w:r>
-        <w:rPr>
-          <w:rStyle w:val="NormalTok"/>
-        </w:rPr>
-        <w:t xml:space="preserve">                            </w:t>
-      </w:r>
-      <w:r>
-        <w:rPr>
-          <w:rStyle w:val="AttributeTok"/>
-        </w:rPr>
-        <w:t xml:space="preserve">levels =</w:t>
-      </w:r>
-      <w:r>
-        <w:rPr>
-          <w:rStyle w:val="NormalTok"/>
-        </w:rPr>
-        <w:t xml:space="preserve"> </w:t>
-      </w:r>
-      <w:r>
-        <w:rPr>
-          <w:rStyle w:val="FunctionTok"/>
-        </w:rPr>
-        <w:t xml:space="preserve">c</w:t>
-      </w:r>
-      <w:r>
-        <w:rPr>
-          <w:rStyle w:val="NormalTok"/>
-        </w:rPr>
-        <w:t xml:space="preserve">(</w:t>
-      </w:r>
-      <w:r>
-        <w:rPr>
-          <w:rStyle w:val="StringTok"/>
-        </w:rPr>
-        <w:t xml:space="preserve">"traditional"</w:t>
-      </w:r>
-      <w:r>
-        <w:rPr>
-          <w:rStyle w:val="NormalTok"/>
-        </w:rPr>
-        <w:t xml:space="preserve">, </w:t>
-      </w:r>
-      <w:r>
-        <w:rPr>
-          <w:rStyle w:val="StringTok"/>
-        </w:rPr>
-        <w:t xml:space="preserve">"forward"</w:t>
-      </w:r>
-      <w:r>
-        <w:rPr>
-          <w:rStyle w:val="NormalTok"/>
-        </w:rPr>
-        <w:t xml:space="preserve">),</w:t>
-      </w:r>
-      <w:r>
-        <w:br/>
-      </w:r>
-      <w:r>
-        <w:rPr>
-          <w:rStyle w:val="NormalTok"/>
-        </w:rPr>
-        <w:t xml:space="preserve">                            </w:t>
-      </w:r>
-      <w:r>
-        <w:rPr>
-          <w:rStyle w:val="AttributeTok"/>
-        </w:rPr>
-        <w:t xml:space="preserve">labels =</w:t>
-      </w:r>
-      <w:r>
-        <w:rPr>
-          <w:rStyle w:val="NormalTok"/>
-        </w:rPr>
-        <w:t xml:space="preserve"> </w:t>
-      </w:r>
-      <w:r>
-        <w:rPr>
-          <w:rStyle w:val="FunctionTok"/>
-        </w:rPr>
-        <w:t xml:space="preserve">c</w:t>
-      </w:r>
-      <w:r>
-        <w:rPr>
-          <w:rStyle w:val="NormalTok"/>
-        </w:rPr>
-        <w:t xml:space="preserve">(</w:t>
-      </w:r>
-      <w:r>
-        <w:rPr>
-          <w:rStyle w:val="StringTok"/>
-        </w:rPr>
-        <w:t xml:space="preserve">"Traditional"</w:t>
-      </w:r>
-      <w:r>
-        <w:rPr>
-          <w:rStyle w:val="NormalTok"/>
-        </w:rPr>
-        <w:t xml:space="preserve">, </w:t>
-      </w:r>
-      <w:r>
-        <w:rPr>
-          <w:rStyle w:val="StringTok"/>
-        </w:rPr>
-        <w:t xml:space="preserve">"Forward Thinking"</w:t>
-      </w:r>
-      <w:r>
-        <w:rPr>
-          <w:rStyle w:val="NormalTok"/>
-        </w:rPr>
-        <w:t xml:space="preserve">))</w:t>
-      </w:r>
-      <w:r>
-        <w:br/>
-      </w:r>
-      <w:r>
-        <w:br/>
-      </w:r>
-      <w:r>
-        <w:rPr>
-          <w:rStyle w:val="NormalTok"/>
-        </w:rPr>
-        <w:t xml:space="preserve">labdata</w:t>
-      </w:r>
-      <w:r>
-        <w:rPr>
-          <w:rStyle w:val="SpecialCharTok"/>
-        </w:rPr>
-        <w:t xml:space="preserve">$</w:t>
-      </w:r>
-      <w:r>
-        <w:rPr>
-          <w:rStyle w:val="NormalTok"/>
-        </w:rPr>
-        <w:t xml:space="preserve">internet </w:t>
-      </w:r>
-      <w:r>
-        <w:rPr>
-          <w:rStyle w:val="OtherTok"/>
-        </w:rPr>
-        <w:t xml:space="preserve">&lt;-</w:t>
-      </w:r>
-      <w:r>
-        <w:rPr>
-          <w:rStyle w:val="NormalTok"/>
-        </w:rPr>
-        <w:t xml:space="preserve"> </w:t>
-      </w:r>
-      <w:r>
-        <w:rPr>
-          <w:rStyle w:val="FunctionTok"/>
-        </w:rPr>
-        <w:t xml:space="preserve">factor</w:t>
-      </w:r>
-      <w:r>
-        <w:rPr>
-          <w:rStyle w:val="NormalTok"/>
-        </w:rPr>
-        <w:t xml:space="preserve">(labdata</w:t>
-      </w:r>
-      <w:r>
-        <w:rPr>
-          <w:rStyle w:val="SpecialCharTok"/>
-        </w:rPr>
-        <w:t xml:space="preserve">$</w:t>
-      </w:r>
-      <w:r>
-        <w:rPr>
-          <w:rStyle w:val="NormalTok"/>
-        </w:rPr>
-        <w:t xml:space="preserve">internet,</w:t>
-      </w:r>
-      <w:r>
-        <w:br/>
-      </w:r>
-      <w:r>
-        <w:rPr>
-          <w:rStyle w:val="NormalTok"/>
-        </w:rPr>
-        <w:t xml:space="preserve">                          </w:t>
-      </w:r>
-      <w:r>
-        <w:rPr>
-          <w:rStyle w:val="AttributeTok"/>
-        </w:rPr>
-        <w:t xml:space="preserve">levels =</w:t>
-      </w:r>
-      <w:r>
-        <w:rPr>
-          <w:rStyle w:val="NormalTok"/>
-        </w:rPr>
-        <w:t xml:space="preserve"> </w:t>
-      </w:r>
-      <w:r>
-        <w:rPr>
-          <w:rStyle w:val="FunctionTok"/>
-        </w:rPr>
-        <w:t xml:space="preserve">c</w:t>
-      </w:r>
-      <w:r>
-        <w:rPr>
-          <w:rStyle w:val="NormalTok"/>
-        </w:rPr>
-        <w:t xml:space="preserve">(</w:t>
-      </w:r>
-      <w:r>
-        <w:rPr>
-          <w:rStyle w:val="StringTok"/>
-        </w:rPr>
-        <w:t xml:space="preserve">"low"</w:t>
-      </w:r>
-      <w:r>
-        <w:rPr>
-          <w:rStyle w:val="NormalTok"/>
-        </w:rPr>
-        <w:t xml:space="preserve">, </w:t>
-      </w:r>
-      <w:r>
-        <w:rPr>
-          <w:rStyle w:val="StringTok"/>
-        </w:rPr>
-        <w:t xml:space="preserve">"medium"</w:t>
-      </w:r>
-      <w:r>
-        <w:rPr>
-          <w:rStyle w:val="NormalTok"/>
-        </w:rPr>
-        <w:t xml:space="preserve">, </w:t>
-      </w:r>
-      <w:r>
-        <w:rPr>
-          <w:rStyle w:val="StringTok"/>
-        </w:rPr>
-        <w:t xml:space="preserve">"high"</w:t>
-      </w:r>
-      <w:r>
-        <w:rPr>
-          <w:rStyle w:val="NormalTok"/>
-        </w:rPr>
-        <w:t xml:space="preserve">),</w:t>
-      </w:r>
-      <w:r>
-        <w:br/>
-      </w:r>
-      <w:r>
-        <w:rPr>
-          <w:rStyle w:val="NormalTok"/>
-        </w:rPr>
-        <w:t xml:space="preserve">                          </w:t>
-      </w:r>
-      <w:r>
-        <w:rPr>
-          <w:rStyle w:val="AttributeTok"/>
-        </w:rPr>
-        <w:t xml:space="preserve">labels =</w:t>
-      </w:r>
-      <w:r>
-        <w:rPr>
-          <w:rStyle w:val="NormalTok"/>
-        </w:rPr>
-        <w:t xml:space="preserve"> </w:t>
-      </w:r>
-      <w:r>
-        <w:rPr>
-          <w:rStyle w:val="FunctionTok"/>
-        </w:rPr>
-        <w:t xml:space="preserve">c</w:t>
-      </w:r>
-      <w:r>
-        <w:rPr>
-          <w:rStyle w:val="NormalTok"/>
-        </w:rPr>
-        <w:t xml:space="preserve">(</w:t>
-      </w:r>
-      <w:r>
-        <w:rPr>
-          <w:rStyle w:val="StringTok"/>
-        </w:rPr>
-        <w:t xml:space="preserve">"Low"</w:t>
-      </w:r>
-      <w:r>
-        <w:rPr>
-          <w:rStyle w:val="NormalTok"/>
-        </w:rPr>
-        <w:t xml:space="preserve">, </w:t>
-      </w:r>
-      <w:r>
-        <w:rPr>
-          <w:rStyle w:val="StringTok"/>
-        </w:rPr>
-        <w:t xml:space="preserve">"Medium"</w:t>
-      </w:r>
-      <w:r>
-        <w:rPr>
-          <w:rStyle w:val="NormalTok"/>
-        </w:rPr>
-        <w:t xml:space="preserve">, </w:t>
-      </w:r>
-      <w:r>
-        <w:rPr>
-          <w:rStyle w:val="StringTok"/>
-        </w:rPr>
-        <w:t xml:space="preserve">"High"</w:t>
-      </w:r>
-      <w:r>
-        <w:rPr>
-          <w:rStyle w:val="NormalTok"/>
-        </w:rPr>
-        <w:t xml:space="preserve">))</w:t>
-      </w:r>
-      <w:r>
-        <w:br/>
-      </w:r>
-      <w:r>
-        <w:br/>
-      </w:r>
-      <w:r>
-        <w:rPr>
-          <w:rStyle w:val="CommentTok"/>
-        </w:rPr>
-        <w:t xml:space="preserve"># Verify factoring</w:t>
-      </w:r>
-      <w:r>
-        <w:br/>
-      </w:r>
-      <w:r>
-        <w:rPr>
-          <w:rStyle w:val="FunctionTok"/>
-        </w:rPr>
-        <w:t xml:space="preserve">table</w:t>
-      </w:r>
-      <w:r>
-        <w:rPr>
-          <w:rStyle w:val="NormalTok"/>
-        </w:rPr>
-        <w:t xml:space="preserve">(labdata</w:t>
-      </w:r>
-      <w:r>
-        <w:rPr>
-          <w:rStyle w:val="SpecialCharTok"/>
-        </w:rPr>
-        <w:t xml:space="preserve">$</w:t>
-      </w:r>
-      <w:r>
-        <w:rPr>
-          <w:rStyle w:val="NormalTok"/>
-        </w:rPr>
-        <w:t xml:space="preserve">biz_focus)</w:t>
-      </w:r>
-    </w:p>
-    <w:p>
-      <w:pPr>
-        <w:pStyle w:val="SourceCode"/>
-      </w:pPr>
-      <w:r>
-        <w:rPr>
-          <w:rStyle w:val="VerbatimChar"/>
-        </w:rPr>
-        <w:t xml:space="preserve">## </w:t>
-      </w:r>
-      <w:r>
-        <w:br/>
-      </w:r>
-      <w:r>
-        <w:rPr>
-          <w:rStyle w:val="VerbatimChar"/>
-        </w:rPr>
-        <w:t xml:space="preserve">##      Traditional Forward Thinking </w:t>
-      </w:r>
-      <w:r>
-        <w:br/>
-      </w:r>
-      <w:r>
-        <w:rPr>
-          <w:rStyle w:val="VerbatimChar"/>
-        </w:rPr>
-        <w:t xml:space="preserve">##              150              150</w:t>
-      </w:r>
-    </w:p>
-    <w:p>
-      <w:pPr>
-        <w:pStyle w:val="SourceCode"/>
-      </w:pPr>
-      <w:r>
-        <w:rPr>
-          <w:rStyle w:val="FunctionTok"/>
-        </w:rPr>
-        <w:t xml:space="preserve">table</w:t>
-      </w:r>
-      <w:r>
-        <w:rPr>
-          <w:rStyle w:val="NormalTok"/>
-        </w:rPr>
-        <w:t xml:space="preserve">(labdata</w:t>
-      </w:r>
-      <w:r>
-        <w:rPr>
-          <w:rStyle w:val="SpecialCharTok"/>
-        </w:rPr>
-        <w:t xml:space="preserve">$</w:t>
-      </w:r>
-      <w:r>
-        <w:rPr>
-          <w:rStyle w:val="NormalTok"/>
-        </w:rPr>
-        <w:t xml:space="preserve">internet)</w:t>
-      </w:r>
-    </w:p>
-    <w:p>
-      <w:pPr>
-        <w:pStyle w:val="SourceCode"/>
-      </w:pPr>
-      <w:r>
-        <w:rPr>
-          <w:rStyle w:val="VerbatimChar"/>
-        </w:rPr>
-        <w:t xml:space="preserve">## </w:t>
-      </w:r>
-      <w:r>
-        <w:br/>
-      </w:r>
-      <w:r>
-        <w:rPr>
-          <w:rStyle w:val="VerbatimChar"/>
-        </w:rPr>
-        <w:t xml:space="preserve">##    Low Medium   High </w:t>
-      </w:r>
-      <w:r>
-        <w:br/>
-      </w:r>
-      <w:r>
-        <w:rPr>
-          <w:rStyle w:val="VerbatimChar"/>
-        </w:rPr>
-        <w:t xml:space="preserve">##    100    100    100</w:t>
-      </w:r>
-    </w:p>
-    <w:p>
-      <w:pPr>
-        <w:pStyle w:val="SourceCode"/>
-      </w:pPr>
-      <w:r>
-        <w:rPr>
-          <w:rStyle w:val="CommentTok"/>
-        </w:rPr>
-        <w:t xml:space="preserve"># Create cleanup theme for professional graphs</w:t>
-      </w:r>
-      <w:r>
-        <w:br/>
-      </w:r>
-      <w:r>
-        <w:rPr>
-          <w:rStyle w:val="NormalTok"/>
-        </w:rPr>
-        <w:t xml:space="preserve">cleanup </w:t>
-      </w:r>
-      <w:r>
-        <w:rPr>
-          <w:rStyle w:val="OtherTok"/>
-        </w:rPr>
-        <w:t xml:space="preserve">&lt;-</w:t>
-      </w:r>
-      <w:r>
-        <w:rPr>
-          <w:rStyle w:val="NormalTok"/>
-        </w:rPr>
-        <w:t xml:space="preserve"> </w:t>
-      </w:r>
-      <w:r>
-        <w:rPr>
-          <w:rStyle w:val="FunctionTok"/>
-        </w:rPr>
-        <w:t xml:space="preserve">theme</w:t>
-      </w:r>
-      <w:r>
-        <w:rPr>
-          <w:rStyle w:val="NormalTok"/>
-        </w:rPr>
-        <w:t xml:space="preserve">(</w:t>
-      </w:r>
-      <w:r>
-        <w:rPr>
-          <w:rStyle w:val="AttributeTok"/>
-        </w:rPr>
-        <w:t xml:space="preserve">panel.grid.major =</w:t>
-      </w:r>
-      <w:r>
-        <w:rPr>
-          <w:rStyle w:val="NormalTok"/>
-        </w:rPr>
-        <w:t xml:space="preserve"> </w:t>
-      </w:r>
-      <w:r>
-        <w:rPr>
-          <w:rStyle w:val="FunctionTok"/>
-        </w:rPr>
-        <w:t xml:space="preserve">element_blank</w:t>
-      </w:r>
-      <w:r>
-        <w:rPr>
-          <w:rStyle w:val="NormalTok"/>
-        </w:rPr>
-        <w:t xml:space="preserve">(),</w:t>
-      </w:r>
-      <w:r>
-        <w:br/>
-      </w:r>
-      <w:r>
-        <w:rPr>
-          <w:rStyle w:val="NormalTok"/>
-        </w:rPr>
-        <w:t xml:space="preserve">                </w:t>
-      </w:r>
-      <w:r>
-        <w:rPr>
-          <w:rStyle w:val="AttributeTok"/>
-        </w:rPr>
-        <w:t xml:space="preserve">panel.grid.minor =</w:t>
-      </w:r>
-      <w:r>
-        <w:rPr>
-          <w:rStyle w:val="NormalTok"/>
-        </w:rPr>
-        <w:t xml:space="preserve"> </w:t>
-      </w:r>
-      <w:r>
-        <w:rPr>
-          <w:rStyle w:val="FunctionTok"/>
-        </w:rPr>
-        <w:t xml:space="preserve">element_blank</w:t>
-      </w:r>
-      <w:r>
-        <w:rPr>
-          <w:rStyle w:val="NormalTok"/>
-        </w:rPr>
-        <w:t xml:space="preserve">(),</w:t>
-      </w:r>
-      <w:r>
-        <w:br/>
-      </w:r>
-      <w:r>
-        <w:rPr>
-          <w:rStyle w:val="NormalTok"/>
-        </w:rPr>
-        <w:t xml:space="preserve">                </w:t>
-      </w:r>
-      <w:r>
-        <w:rPr>
-          <w:rStyle w:val="AttributeTok"/>
-        </w:rPr>
-        <w:t xml:space="preserve">panel.background =</w:t>
-      </w:r>
-      <w:r>
-        <w:rPr>
-          <w:rStyle w:val="NormalTok"/>
-        </w:rPr>
-        <w:t xml:space="preserve"> </w:t>
-      </w:r>
-      <w:r>
-        <w:rPr>
-          <w:rStyle w:val="FunctionTok"/>
-        </w:rPr>
-        <w:t xml:space="preserve">element_blank</w:t>
-      </w:r>
-      <w:r>
-        <w:rPr>
-          <w:rStyle w:val="NormalTok"/>
-        </w:rPr>
-        <w:t xml:space="preserve">(),</w:t>
-      </w:r>
-      <w:r>
-        <w:br/>
-      </w:r>
-      <w:r>
-        <w:rPr>
-          <w:rStyle w:val="NormalTok"/>
-        </w:rPr>
-        <w:t xml:space="preserve">                </w:t>
-      </w:r>
-      <w:r>
-        <w:rPr>
-          <w:rStyle w:val="AttributeTok"/>
-        </w:rPr>
-        <w:t xml:space="preserve">axis.line.x =</w:t>
-      </w:r>
-      <w:r>
-        <w:rPr>
-          <w:rStyle w:val="NormalTok"/>
-        </w:rPr>
-        <w:t xml:space="preserve"> </w:t>
-      </w:r>
-      <w:r>
-        <w:rPr>
-          <w:rStyle w:val="FunctionTok"/>
-        </w:rPr>
-        <w:t xml:space="preserve">element_line</w:t>
-      </w:r>
-      <w:r>
-        <w:rPr>
-          <w:rStyle w:val="NormalTok"/>
-        </w:rPr>
-        <w:t xml:space="preserve">(</w:t>
-      </w:r>
-      <w:r>
-        <w:rPr>
-          <w:rStyle w:val="AttributeTok"/>
-        </w:rPr>
-        <w:t xml:space="preserve">color =</w:t>
-      </w:r>
-      <w:r>
-        <w:rPr>
-          <w:rStyle w:val="NormalTok"/>
-        </w:rPr>
-        <w:t xml:space="preserve"> </w:t>
-      </w:r>
-      <w:r>
-        <w:rPr>
-          <w:rStyle w:val="StringTok"/>
-        </w:rPr>
-        <w:t xml:space="preserve">'black'</w:t>
-      </w:r>
-      <w:r>
-        <w:rPr>
-          <w:rStyle w:val="NormalTok"/>
-        </w:rPr>
-        <w:t xml:space="preserve">),</w:t>
-      </w:r>
-      <w:r>
-        <w:br/>
-      </w:r>
-      <w:r>
-        <w:rPr>
-          <w:rStyle w:val="NormalTok"/>
-        </w:rPr>
-        <w:t xml:space="preserve">                </w:t>
-      </w:r>
-      <w:r>
-        <w:rPr>
-          <w:rStyle w:val="AttributeTok"/>
-        </w:rPr>
-        <w:t xml:space="preserve">axis.line.y =</w:t>
-      </w:r>
-      <w:r>
-        <w:rPr>
-          <w:rStyle w:val="NormalTok"/>
-        </w:rPr>
-        <w:t xml:space="preserve"> </w:t>
-      </w:r>
-      <w:r>
-        <w:rPr>
-          <w:rStyle w:val="FunctionTok"/>
-        </w:rPr>
-        <w:t xml:space="preserve">element_line</w:t>
-      </w:r>
-      <w:r>
-        <w:rPr>
-          <w:rStyle w:val="NormalTok"/>
-        </w:rPr>
-        <w:t xml:space="preserve">(</w:t>
-      </w:r>
-      <w:r>
-        <w:rPr>
-          <w:rStyle w:val="AttributeTok"/>
-        </w:rPr>
-        <w:t xml:space="preserve">color =</w:t>
-      </w:r>
-      <w:r>
-        <w:rPr>
-          <w:rStyle w:val="NormalTok"/>
-        </w:rPr>
-        <w:t xml:space="preserve"> </w:t>
-      </w:r>
-      <w:r>
-        <w:rPr>
-          <w:rStyle w:val="StringTok"/>
-        </w:rPr>
-        <w:t xml:space="preserve">'black'</w:t>
-      </w:r>
-      <w:r>
-        <w:rPr>
-          <w:rStyle w:val="NormalTok"/>
-        </w:rPr>
-        <w:t xml:space="preserve">),</w:t>
-      </w:r>
-      <w:r>
-        <w:br/>
-      </w:r>
-      <w:r>
-        <w:rPr>
-          <w:rStyle w:val="NormalTok"/>
-        </w:rPr>
-        <w:t xml:space="preserve">                </w:t>
-      </w:r>
-      <w:r>
-        <w:rPr>
-          <w:rStyle w:val="AttributeTok"/>
-        </w:rPr>
-        <w:t xml:space="preserve">legend.key =</w:t>
-      </w:r>
-      <w:r>
-        <w:rPr>
-          <w:rStyle w:val="NormalTok"/>
-        </w:rPr>
-        <w:t xml:space="preserve"> </w:t>
-      </w:r>
-      <w:r>
-        <w:rPr>
-          <w:rStyle w:val="FunctionTok"/>
-        </w:rPr>
-        <w:t xml:space="preserve">element_rect</w:t>
-      </w:r>
-      <w:r>
-        <w:rPr>
-          <w:rStyle w:val="NormalTok"/>
-        </w:rPr>
-        <w:t xml:space="preserve">(</w:t>
-      </w:r>
-      <w:r>
-        <w:rPr>
-          <w:rStyle w:val="AttributeTok"/>
-        </w:rPr>
-        <w:t xml:space="preserve">fill =</w:t>
-      </w:r>
-      <w:r>
-        <w:rPr>
-          <w:rStyle w:val="NormalTok"/>
-        </w:rPr>
-        <w:t xml:space="preserve"> </w:t>
-      </w:r>
-      <w:r>
-        <w:rPr>
-          <w:rStyle w:val="StringTok"/>
-        </w:rPr>
-        <w:t xml:space="preserve">'white'</w:t>
-      </w:r>
-      <w:r>
-        <w:rPr>
-          <w:rStyle w:val="NormalTok"/>
-        </w:rPr>
-        <w:t xml:space="preserve">),</w:t>
-      </w:r>
-      <w:r>
-        <w:br/>
-      </w:r>
-      <w:r>
-        <w:rPr>
-          <w:rStyle w:val="NormalTok"/>
-        </w:rPr>
-        <w:t xml:space="preserve">                </w:t>
-      </w:r>
-      <w:r>
-        <w:rPr>
-          <w:rStyle w:val="AttributeTok"/>
-        </w:rPr>
-        <w:t xml:space="preserve">text =</w:t>
-      </w:r>
-      <w:r>
-        <w:rPr>
-          <w:rStyle w:val="NormalTok"/>
-        </w:rPr>
-        <w:t xml:space="preserve"> </w:t>
-      </w:r>
-      <w:r>
-        <w:rPr>
-          <w:rStyle w:val="FunctionTok"/>
-        </w:rPr>
-        <w:t xml:space="preserve">element_text</w:t>
-      </w:r>
-      <w:r>
-        <w:rPr>
-          <w:rStyle w:val="NormalTok"/>
-        </w:rPr>
-        <w:t xml:space="preserve">(</w:t>
-      </w:r>
-      <w:r>
-        <w:rPr>
-          <w:rStyle w:val="AttributeTok"/>
-        </w:rPr>
-        <w:t xml:space="preserve">size =</w:t>
-      </w:r>
-      <w:r>
-        <w:rPr>
-          <w:rStyle w:val="NormalTok"/>
-        </w:rPr>
-        <w:t xml:space="preserve"> </w:t>
-      </w:r>
-      <w:r>
-        <w:rPr>
-          <w:rStyle w:val="DecValTok"/>
-        </w:rPr>
-        <w:t xml:space="preserve">15</w:t>
-      </w:r>
-      <w:r>
-        <w:rPr>
-          <w:rStyle w:val="NormalTok"/>
-        </w:rPr>
-        <w:t xml:space="preserve">))</w:t>
       </w:r>
     </w:p>
     <w:p>

</xml_diff>